<commit_message>
Khung stub cho package meanshift, test mẫu và phân công nhóm
</commit_message>
<xml_diff>
--- a/Proposal_MeanShift.docx
+++ b/Proposal_MeanShift.docx
@@ -269,8 +269,78 @@
           <w:rFonts w:ascii="Times New Roman" w:hAnsi="Times New Roman" w:eastAsia="Times New Roman" w:cs="Times New Roman"/>
           <w:sz w:val="26"/>
           <w:szCs w:val="26"/>
-        </w:rPr>
-        <w:t>So sánh với K-Means, DBSCAN, GMM; đo tốc độ; phân tích ảnh hưởng của h.</w:t>
+          <w:b/>
+          <w:bCs/>
+        </w:rPr>
+        <w:t xml:space="preserve">So sánh với K-Means, DBSCAN, GMM</w:t>
+      </w:r>
+      <w:r>
+        <w:rPr>
+          <w:rFonts w:ascii="Times New Roman" w:hAnsi="Times New Roman" w:eastAsia="Times New Roman" w:cs="Times New Roman"/>
+          <w:sz w:val="26"/>
+          <w:szCs w:val="26"/>
+        </w:rPr>
+        <w:t xml:space="preserve"> trên dữ liệu giả lập (5 bộ: blobs, blobs_varied, blobs_aniso, moons, circles; mỗi bộ 10 seed, 1500 điểm). Đo ARI, NMI so với nhãn đúng và số cụm tìm được.</w:t>
+      </w:r>
+    </w:p>
+    <w:p>
+      <w:pPr>
+        <w:pStyle w:val="ListParagraph"/>
+        <w:numPr>
+          <w:ilvl w:val="0"/>
+          <w:numId w:val="2"/>
+        </w:numPr>
+        <w:spacing w:after="60"/>
+        <w:ind w:left="540" w:hanging="360"/>
+        <w:jc w:val="both"/>
+      </w:pPr>
+      <w:r>
+        <w:rPr>
+          <w:rFonts w:ascii="Times New Roman" w:hAnsi="Times New Roman" w:eastAsia="Times New Roman" w:cs="Times New Roman"/>
+          <w:sz w:val="26"/>
+          <w:szCs w:val="26"/>
+          <w:b/>
+          <w:bCs/>
+        </w:rPr>
+        <w:t xml:space="preserve">Đo tốc độ</w:t>
+      </w:r>
+      <w:r>
+        <w:rPr>
+          <w:rFonts w:ascii="Times New Roman" w:hAnsi="Times New Roman" w:eastAsia="Times New Roman" w:cs="Times New Roman"/>
+          <w:sz w:val="26"/>
+          <w:szCs w:val="26"/>
+        </w:rPr>
+        <w:t xml:space="preserve"> trên dữ liệu giả lập sinh riêng với số điểm tăng dần (n = 500 → 50.000): bản brute-force vs KD-Tree vs sklearn. Đo thời gian chạy và bộ nhớ.</w:t>
+      </w:r>
+    </w:p>
+    <w:p>
+      <w:pPr>
+        <w:pStyle w:val="ListParagraph"/>
+        <w:numPr>
+          <w:ilvl w:val="0"/>
+          <w:numId w:val="2"/>
+        </w:numPr>
+        <w:spacing w:after="60"/>
+        <w:ind w:left="540" w:hanging="360"/>
+        <w:jc w:val="both"/>
+      </w:pPr>
+      <w:r>
+        <w:rPr>
+          <w:rFonts w:ascii="Times New Roman" w:hAnsi="Times New Roman" w:eastAsia="Times New Roman" w:cs="Times New Roman"/>
+          <w:sz w:val="26"/>
+          <w:szCs w:val="26"/>
+          <w:b/>
+          <w:bCs/>
+        </w:rPr>
+        <w:t xml:space="preserve">Phân tích ảnh hưởng của h</w:t>
+      </w:r>
+      <w:r>
+        <w:rPr>
+          <w:rFonts w:ascii="Times New Roman" w:hAnsi="Times New Roman" w:eastAsia="Times New Roman" w:cs="Times New Roman"/>
+          <w:sz w:val="26"/>
+          <w:szCs w:val="26"/>
+        </w:rPr>
+        <w:t xml:space="preserve"> trên cả dữ liệu giả lập (số cụm, ARI) và 100 ảnh tune của ISIC (Dice).</w:t>
       </w:r>
     </w:p>
     <w:p>
@@ -5298,27 +5368,7 @@
           <w:sz w:val="26"/>
           <w:szCs w:val="26"/>
         </w:rPr>
-        <w:t>4.5. Tóm tắt c</w:t>
-      </w:r>
-      <w:r>
-        <w:rPr>
-          <w:rFonts w:ascii="Times New Roman" w:hAnsi="Times New Roman" w:eastAsia="Times New Roman" w:cs="Times New Roman"/>
-          <w:b/>
-          <w:bCs/>
-          <w:sz w:val="26"/>
-          <w:szCs w:val="26"/>
-        </w:rPr>
-        <w:t>hương</w:t>
-      </w:r>
-      <w:r>
-        <w:rPr>
-          <w:rFonts w:ascii="Times New Roman" w:hAnsi="Times New Roman" w:eastAsia="Times New Roman" w:cs="Times New Roman"/>
-          <w:b/>
-          <w:bCs/>
-          <w:sz w:val="26"/>
-          <w:szCs w:val="26"/>
-        </w:rPr>
-        <w:t>:</w:t>
+        <w:t>4.5. Tóm tắt chương:</w:t>
       </w:r>
       <w:r>
         <w:rPr>
@@ -5360,27 +5410,7 @@
           <w:sz w:val="26"/>
           <w:szCs w:val="26"/>
         </w:rPr>
-        <w:t>5.1. Kết quả đạt đư</w:t>
-      </w:r>
-      <w:r>
-        <w:rPr>
-          <w:rFonts w:ascii="Times New Roman" w:hAnsi="Times New Roman" w:eastAsia="Times New Roman" w:cs="Times New Roman"/>
-          <w:b/>
-          <w:bCs/>
-          <w:sz w:val="26"/>
-          <w:szCs w:val="26"/>
-        </w:rPr>
-        <w:t>ợc</w:t>
-      </w:r>
-      <w:r>
-        <w:rPr>
-          <w:rFonts w:ascii="Times New Roman" w:hAnsi="Times New Roman" w:eastAsia="Times New Roman" w:cs="Times New Roman"/>
-          <w:b/>
-          <w:bCs/>
-          <w:sz w:val="26"/>
-          <w:szCs w:val="26"/>
-        </w:rPr>
-        <w:t>:</w:t>
+        <w:t>5.1. Kết quả đạt được:</w:t>
       </w:r>
       <w:r>
         <w:rPr>
@@ -5406,27 +5436,7 @@
           <w:sz w:val="26"/>
           <w:szCs w:val="26"/>
         </w:rPr>
-        <w:t>5.2. Hạn ch</w:t>
-      </w:r>
-      <w:r>
-        <w:rPr>
-          <w:rFonts w:ascii="Times New Roman" w:hAnsi="Times New Roman" w:eastAsia="Times New Roman" w:cs="Times New Roman"/>
-          <w:b/>
-          <w:bCs/>
-          <w:sz w:val="26"/>
-          <w:szCs w:val="26"/>
-        </w:rPr>
-        <w:t>ế</w:t>
-      </w:r>
-      <w:r>
-        <w:rPr>
-          <w:rFonts w:ascii="Times New Roman" w:hAnsi="Times New Roman" w:eastAsia="Times New Roman" w:cs="Times New Roman"/>
-          <w:b/>
-          <w:bCs/>
-          <w:sz w:val="26"/>
-          <w:szCs w:val="26"/>
-        </w:rPr>
-        <w:t>:</w:t>
+        <w:t>5.2. Hạn chế:</w:t>
       </w:r>
       <w:r>
         <w:rPr>
@@ -5452,27 +5462,7 @@
           <w:sz w:val="26"/>
           <w:szCs w:val="26"/>
         </w:rPr>
-        <w:t>5.3. Hướng phá</w:t>
-      </w:r>
-      <w:r>
-        <w:rPr>
-          <w:rFonts w:ascii="Times New Roman" w:hAnsi="Times New Roman" w:eastAsia="Times New Roman" w:cs="Times New Roman"/>
-          <w:b/>
-          <w:bCs/>
-          <w:sz w:val="26"/>
-          <w:szCs w:val="26"/>
-        </w:rPr>
-        <w:t>t triển</w:t>
-      </w:r>
-      <w:r>
-        <w:rPr>
-          <w:rFonts w:ascii="Times New Roman" w:hAnsi="Times New Roman" w:eastAsia="Times New Roman" w:cs="Times New Roman"/>
-          <w:b/>
-          <w:bCs/>
-          <w:sz w:val="26"/>
-          <w:szCs w:val="26"/>
-        </w:rPr>
-        <w:t>:</w:t>
+        <w:t>5.3. Hướng phát triển:</w:t>
       </w:r>
       <w:r>
         <w:rPr>

</xml_diff>